<commit_message>
fix: align Foliquo v0.11.10 releases
</commit_message>
<xml_diff>
--- a/dist/demo/assets/en-final.docx
+++ b/dist/demo/assets/en-final.docx
@@ -231,7 +231,7 @@
     </w:p>
     <w:tbl>
       <w:tblPr>
-        <w:tblW w:w="3088" w:type="dxa"/>
+        <w:tblW w:w="3424" w:type="dxa"/>
         <w:tblLayout w:type="fixed"/>
         <w:tblBorders>
           <w:top w:val="single" w:sz="4" w:color="000000"/>
@@ -249,7 +249,7 @@
         </w:tblCellMar>
       </w:tblPr>
       <w:tblGrid>
-        <w:gridCol w:w="3088"/>
+        <w:gridCol w:w="3424"/>
       </w:tblGrid>
       <w:tr>
         <w:trPr>
@@ -257,7 +257,7 @@
         </w:trPr>
         <w:tc>
           <w:tcPr>
-            <w:tcW w:w="3088" w:type="dxa"/>
+            <w:tcW w:w="3424" w:type="dxa"/>
           </w:tcPr>
           <w:p>
             <w:pPr>
@@ -280,7 +280,7 @@
                 <w:sz w:val="22"/>
                 <w:szCs w:val="22"/>
               </w:rPr>
-              <w:t xml:space="preserve">[Signature: unreadable]</w:t>
+              <w:t xml:space="preserve">[Unterschrift: unleserlich]</w:t>
             </w:r>
           </w:p>
         </w:tc>

</xml_diff>